<commit_message>
docs(use-case): đặc tả use case v2 theo code (Customer 19, Manager 23, Admin 5) + changelog + sơ đồ tổng hợp
</commit_message>
<xml_diff>
--- a/docs/use-cases/admin/admin-use-case-specifications-v2.docx
+++ b/docs/use-cases/admin/admin-use-case-specifications-v2.docx
@@ -386,7 +386,7 @@
                 <w:b w:val="0"/>
                 <w:sz w:val="17"/>
               </w:rPr>
-              <w:t>Vận hành khách hàng, sản phẩm, đơn, phản hồi, khảo sát, voucher, chăm sóc và báo cáo.</w:t>
+              <w:t>Vận hành khách hàng, sản phẩm, đơn, phản hồi, khảo sát, voucher, chăm sóc và báo cáo; audit log chỉ hiển thị bản ghi do Manager thực hiện. Lịch sử hoạt động Customer xem riêng trong hồ sơ 360°.</w:t>
             </w:r>
           </w:p>
         </w:tc>
@@ -414,7 +414,7 @@
           </w:tcPr>
           <w:p>
             <w:r>
-              <w:t>Quản lý tài khoản nội bộ, audit log và tổng quan; được xem danh mục trong phạm vi được phép đọc theo PRD mục 5.2.</w:t>
+              <w:t>Quản lý tài khoản nội bộ; xem toàn bộ audit log và tổng quan; xem danh mục được phép đọc theo PRD mục 5.2.</w:t>
             </w:r>
           </w:p>
         </w:tc>
@@ -1998,7 +1998,7 @@
                 <w:b w:val="0"/>
                 <w:sz w:val="17"/>
               </w:rPr>
-              <w:t>Thành công: xem sự kiện audit trong phạm vi quyền. Thất bại: dữ liệu không đổi.</w:t>
+              <w:t>Thành công: Admin xem bản ghi audit phù hợp bộ lọc truy vấn. Thất bại: dữ liệu không đổi.</w:t>
             </w:r>
           </w:p>
         </w:tc>
@@ -2024,12 +2024,12 @@
     </w:p>
     <w:p>
       <w:r>
-        <w:t>3. Hệ thống trả các sự kiện phù hợp.</w:t>
+        <w:t>3. Hệ thống trả các bản ghi audit phù hợp bộ lọc truy vấn; Admin được xem toàn bộ bản ghi.</w:t>
       </w:r>
     </w:p>
     <w:p>
       <w:r>
-        <w:t>4. Admin xem người thực hiện, hành động, đối tượng và thời điểm.</w:t>
+        <w:t>4. Admin xem vai trò người thực hiện, hành động, đối tượng và thời điểm.</w:t>
       </w:r>
     </w:p>
     <w:p>
@@ -2074,7 +2074,7 @@
         <w:pStyle w:val="ListBullet"/>
       </w:pPr>
       <w:r>
-        <w:t>Route Admin xem audit log tồn tại. Route Manager riêng cũng tồn tại; phạm vi quyền Manager cần xác nhận.</w:t>
+        <w:t>Admin xem toàn bộ bản ghi audit phù hợp bộ lọc. Manager chỉ xem các sự kiện do Manager thực hiện; vì vậy Manager không thấy thao tác quản lý tài khoản nội bộ do Admin thực hiện và có thể không thấy sự kiện do Customer thực hiện như hủy đơn hoặc xác nhận đã nhận hàng. Lịch sử hoạt động Customer vẫn xem riêng trong hồ sơ 360°.</w:t>
       </w:r>
     </w:p>
     <w:p>

</xml_diff>